<commit_message>
Switch container to the navy wrap
Navy billboard wrap becomes the default; 4K stills and v3 brief updated
to match.

Co-Authored-By: Claude Opus 5.5 <noreply@anthropic.com>
Claude-Session: https://claude.ai/code/session_01UoyugYzmaTfuHsWdpUMhBc
</commit_message>
<xml_diff>
--- a/court-viz/brief/Hoop Hub Phase 1 - Concept Visual Brief v3.docx
+++ b/court-viz/brief/Hoop Hub Phase 1 - Concept Visual Brief v3.docx
@@ -191,7 +191,7 @@
                 <w:color w:val="334155"/>
                 <w:sz w:val="18"/>
               </w:rPr>
-              <w:t>Container is now a bright billboard in a gold wrap: huge logo and tagline on both long sides, a QR code (Book a FREE Trial) and round logo on the doors. Full-width ramp; two ball racks inside, no hanging bags.</w:t>
+              <w:t>Container is now a billboard in a navy wrap with a gold stripe: huge logo and tagline on both long sides, a QR code (Book a FREE Trial) and round logo on the doors. Full-width ramp; two ball racks inside, no hanging bags.</w:t>
             </w:r>
           </w:p>
           <w:p>
@@ -599,7 +599,7 @@
           <w:color w:val="334155"/>
           <w:sz w:val="20"/>
         </w:rPr>
-        <w:t>one 8 ft steel container, square to the court, set back behind and to one side of the main hoop, off the tiles. Wrapped as a bright gold billboard that is clearly ours and doubles as an advert.</w:t>
+        <w:t>one 8 ft steel container, square to the court, set back behind and to one side of the main hoop, off the tiles. Wrapped as a navy and gold billboard that is clearly ours and doubles as an advert.</w:t>
       </w:r>
     </w:p>
     <w:p>
@@ -2938,7 +2938,7 @@
                 <w:color w:val="334155"/>
                 <w:sz w:val="18"/>
               </w:rPr>
-              <w:t>Full vinyl wrap, gold #fba91a base with a navy #14264e stripe low down. Lettering and artwork as Section 8</w:t>
+              <w:t>Full vinyl wrap, navy #14264e base with a gold #fba91a stripe low down. Lettering and artwork as Section 8</w:t>
             </w:r>
           </w:p>
         </w:tc>
@@ -3085,7 +3085,7 @@
           <w:color w:val="334155"/>
           <w:sz w:val="20"/>
         </w:rPr>
-        <w:t>Logo versions, all from the Hoop Heroes Drive (05 - Marketing / 01 - Logos &amp; Brand): landscape logo with gold icon and white wordmark (court surface, Mega Slam pad); landscape logo with white icon and navy wordmark (gold container sides); round logo, navy (backboards, gold container doors and far end). Hoop Heroes will supply the artwork files.</w:t>
+        <w:t>Logo versions, all from the Hoop Heroes Drive (05 - Marketing / 01 - Logos &amp; Brand): landscape logo with gold icon and white wordmark (court surface, Mega Slam pad, container sides); round logo, navy (backboards); round logo, white (container doors and far end). Hoop Heroes will supply the artwork files.</w:t>
       </w:r>
     </w:p>
     <w:p>
@@ -4341,7 +4341,7 @@
           <w:color w:val="334155"/>
           <w:sz w:val="20"/>
         </w:rPr>
-        <w:t>full vinyl wrap: gold #fba91a base with a navy #14264e stripe low down. Both long sides: the landscape logo (white icon, navy wordmark) as large as fits, with 'SWAP SCREENTIME FOR GAMETIME' beneath in navy Lilita One. Doors: one leaf carries a white panel with 'SCAN TO BOOK A FREE TRIAL' and a navy QR code; the other carries the round navy logo and 'HOOP HEROES'. Keep both clear of the vertical locking bars. Far end: the round navy logo, large. No contact details or school name.</w:t>
+        <w:t>full vinyl wrap: navy #14264e base with a gold #fba91a stripe low down. Both long sides: the landscape logo (gold icon, white wordmark) as large as fits, with 'SWAP SCREENTIME FOR GAMETIME' beneath in gold Lilita One. Doors: one leaf carries a white panel with 'SCAN TO BOOK A FREE TRIAL' and a navy QR code; the other carries the round white logo and 'HOOP HEROES' in gold. Keep both clear of the vertical locking bars. Far end: the round white logo, large. No contact details or school name.</w:t>
       </w:r>
     </w:p>
     <w:p>
@@ -4722,7 +4722,7 @@
           <w:color w:val="334155"/>
           <w:sz w:val="20"/>
         </w:rPr>
-        <w:t>eye level, about 3 m from the open doors, 24 to 28 mm lens, court visible beside. Folded hoops and the two ball racks inside, full-width ramp at the sill; the gold billboard side partly visible. Optional: one portable hoop half rolled out down the ramp.</w:t>
+        <w:t>eye level, about 3 m from the open doors, 24 to 28 mm lens, court visible beside. Folded hoops and the two ball racks inside, full-width ramp at the sill; the navy billboard side partly visible. Optional: one portable hoop half rolled out down the ramp.</w:t>
       </w:r>
     </w:p>
     <w:p>

</xml_diff>

<commit_message>
Hub in a box: 10 ft container and 40-panel floor
Container grows to a 10 ft unit that carries the whole kit: 40 floor
panels (1.85 x 2.0 m) strapped on edge at the back with the front panel
showing its piece of court, a gold ball rack down the side and both
folded hoops in front on the full-width ramp. Court shows faint panel
joints. 4K stills, plan and v3 brief updated; old detail renders removed.

Co-Authored-By: Claude Opus 5.5 <noreply@anthropic.com>
Claude-Session: https://claude.ai/code/session_01UoyugYzmaTfuHsWdpUMhBc
</commit_message>
<xml_diff>
--- a/court-viz/brief/Hoop Hub Phase 1 - Concept Visual Brief v3.docx
+++ b/court-viz/brief/Hoop Hub Phase 1 - Concept Visual Brief v3.docx
@@ -206,6 +206,21 @@
                 <w:color w:val="334155"/>
                 <w:sz w:val="18"/>
               </w:rPr>
+              <w:t>Hub in a box: a 10 ft container carries the whole kit - the floor, both portable hoops and the balls. The floor is now 40 large panels (1.85 x 2.0 m) instead of about 1,650 small tiles, so it goes down and comes up quickly.</w:t>
+            </w:r>
+          </w:p>
+          <w:p>
+            <w:pPr>
+              <w:pStyle w:val="ListBullet"/>
+            </w:pPr>
+            <w:r>
+              <w:rPr>
+                <w:rFonts w:ascii="Montserrat" w:hAnsi="Montserrat" w:eastAsia="Montserrat"/>
+                <w:b w:val="0"/>
+                <w:i w:val="0"/>
+                <w:color w:val="334155"/>
+                <w:sz w:val="18"/>
+              </w:rPr>
               <w:t>Mega Slam padding is navy. The round Hoop Heroes logo goes on all three backboards.</w:t>
             </w:r>
           </w:p>
@@ -361,7 +376,7 @@
           <w:color w:val="334155"/>
           <w:sz w:val="20"/>
         </w:rPr>
-        <w:t>mid-grey court tiles, a lighter grey key, white lines including the 2-point arc, and a slim lighter border around the tile edge, as in the reference.</w:t>
+        <w:t>mid-grey court panels, a lighter grey key, white lines including the 2-point arc, and a slim lighter border around the edge, as in the reference.</w:t>
       </w:r>
     </w:p>
     <w:p>
@@ -469,7 +484,7 @@
           <w:color w:val="334155"/>
           <w:sz w:val="20"/>
         </w:rPr>
-        <w:t>modular plastic court tiles, 14.8 m wide x 10.0 m deep, laid directly on the playground tarmac.</w:t>
+        <w:t>40 large modular court panels, each 1.85 x 2.0 m, laid 8 across and 5 deep to make 14.8 m wide x 10.0 m deep, directly on the playground tarmac. Show the panel joints faintly.</w:t>
       </w:r>
     </w:p>
     <w:p>
@@ -599,7 +614,7 @@
           <w:color w:val="334155"/>
           <w:sz w:val="20"/>
         </w:rPr>
-        <w:t>one 8 ft steel container, square to the court, set back behind and to one side of the main hoop, off the tiles. Wrapped as a navy and gold billboard that is clearly ours and doubles as an advert.</w:t>
+        <w:t>one 10 ft steel container, square to the court, set back behind and to one side of the main hoop, off the tiles. It is the hub in a box: it arrives holding the floor panels, both portable hoops and the balls, and is wrapped as a navy and gold billboard that is clearly ours and doubles as an advert.</w:t>
       </w:r>
     </w:p>
     <w:p>
@@ -819,7 +834,7 @@
                 <w:color w:val="14264E"/>
                 <w:sz w:val="18"/>
               </w:rPr>
-              <w:t>Tile area (whole court)</w:t>
+              <w:t>Floor (whole court)</w:t>
             </w:r>
           </w:p>
         </w:tc>
@@ -837,7 +852,7 @@
                 <w:color w:val="334155"/>
                 <w:sz w:val="18"/>
               </w:rPr>
-              <w:t>14.8 m wide x 10.0 m deep (148 m²), tiles 300 x 300 mm, 15 mm thick</w:t>
+              <w:t>14.8 m wide x 10.0 m deep (148 m²): 40 panels of 1.85 x 2.0 m (8 across the baseline, 5 deep), about 15 to 20 mm thick, faint joints visible</w:t>
             </w:r>
           </w:p>
         </w:tc>
@@ -855,7 +870,7 @@
                 <w:color w:val="334155"/>
                 <w:sz w:val="18"/>
               </w:rPr>
-              <w:t>[DESIGN] / [SUPPLIER]</w:t>
+              <w:t>[DESIGN]</w:t>
             </w:r>
           </w:p>
         </w:tc>
@@ -1789,7 +1804,7 @@
                 <w:color w:val="334155"/>
                 <w:sz w:val="18"/>
               </w:rPr>
-              <w:t>8 ft: 2.44 m long x 2.20 m deep x 2.26 m high. Square to the court, long side parallel to the baseline, set back 2.0 m behind the tiles, to the right of the hoop seen from the open end (roughly 10.9 m to 13.3 m across). Doors on the outer short end</w:t>
+              <w:t>10 ft: 2.99 m long x 2.44 m deep x 2.59 m high. Square to the court, long side parallel to the baseline, set back 2.0 m behind the floor, to the right of the hoop seen from the open end (roughly 10.9 m to 13.9 m across). Doors on the outer short end</w:t>
             </w:r>
           </w:p>
         </w:tc>
@@ -2398,7 +2413,7 @@
                 <w:color w:val="14264E"/>
                 <w:sz w:val="18"/>
               </w:rPr>
-              <w:t>Court tiles</w:t>
+              <w:t>Court panels</w:t>
             </w:r>
           </w:p>
         </w:tc>
@@ -2416,7 +2431,7 @@
                 <w:color w:val="334155"/>
                 <w:sz w:val="18"/>
               </w:rPr>
-              <w:t>Modular polypropylene sports tiles, 300 x 300 x 15 mm, perforated top</w:t>
+              <w:t>Large-format modular sports-surface panels, 1.85 x 2.0 m, perforated top, clipped together</w:t>
             </w:r>
           </w:p>
         </w:tc>
@@ -2434,7 +2449,7 @@
                 <w:color w:val="334155"/>
                 <w:sz w:val="18"/>
               </w:rPr>
-              <w:t>Mid grey (about #6e7276), matt</w:t>
+              <w:t>Mid grey (about #6e7276), matt; faint joints</w:t>
             </w:r>
           </w:p>
         </w:tc>
@@ -4263,7 +4278,7 @@
           <w:color w:val="14264E"/>
           <w:sz w:val="32"/>
         </w:rPr>
-        <w:t>8. STORAGE CONTAINER: 8 FT STEEL CONTAINER AS A BILLBOARD</w:t>
+        <w:t>8. STORAGE CONTAINER: 10 FT HUB IN A BOX AND BILLBOARD</w:t>
       </w:r>
     </w:p>
     <w:p>
@@ -4289,7 +4304,33 @@
           <w:color w:val="334155"/>
           <w:sz w:val="20"/>
         </w:rPr>
-        <w:t>8 ft mini container, 2.44 m long x 2.20 m deep x 2.26 m high, double doors on one 2.20 m end.</w:t>
+        <w:t>10 ft container, 2.99 m long x 2.44 m deep x 2.59 m high, double doors on one 2.44 m end.</w:t>
+      </w:r>
+    </w:p>
+    <w:p>
+      <w:pPr>
+        <w:pStyle w:val="ListBullet"/>
+        <w:spacing w:after="40"/>
+      </w:pPr>
+      <w:r>
+        <w:rPr>
+          <w:rFonts w:ascii="Montserrat" w:hAnsi="Montserrat" w:eastAsia="Montserrat"/>
+          <w:b/>
+          <w:i w:val="0"/>
+          <w:color w:val="14264E"/>
+          <w:sz w:val="20"/>
+        </w:rPr>
+        <w:t xml:space="preserve">Delivery concept - </w:t>
+      </w:r>
+      <w:r>
+        <w:rPr>
+          <w:rFonts w:ascii="Montserrat" w:hAnsi="Montserrat" w:eastAsia="Montserrat"/>
+          <w:b w:val="0"/>
+          <w:i w:val="0"/>
+          <w:color w:val="334155"/>
+          <w:sz w:val="20"/>
+        </w:rPr>
+        <w:t>the Mega Slam is a separate, permanent install done first. The container is then dropped behind it with everything inside: roll the portable hoops out, lay the 40 floor panels, play. Removal is the same in reverse.</w:t>
       </w:r>
     </w:p>
     <w:p>
@@ -4367,7 +4408,7 @@
           <w:color w:val="334155"/>
           <w:sz w:val="20"/>
         </w:rPr>
-        <w:t>two folded portable hoops side by side, wheels towards the doors; two gold ball racks side by side at the back; no hanging bags. A ramp the full width of the doorway, so the hoops roll straight in and out.</w:t>
+        <w:t>the 40 floor panels stand on edge against the back wall, strapped, with the front panel showing its piece of the painted court; a gold ball rack down the side; both folded portable hoops in front, wheels towards the doors. A ramp the full width of the doorway, so the hoops roll straight in and out.</w:t>
       </w:r>
     </w:p>
     <w:p>
@@ -4722,7 +4763,7 @@
           <w:color w:val="334155"/>
           <w:sz w:val="20"/>
         </w:rPr>
-        <w:t>eye level, about 3 m from the open doors, 24 to 28 mm lens, court visible beside. Folded hoops and the two ball racks inside, full-width ramp at the sill; the navy billboard side partly visible. Optional: one portable hoop half rolled out down the ramp.</w:t>
+        <w:t>eye level, about 3 m out, square to the open doors, 24 to 28 mm lens. Shows the hub in a box: the panel stack at the back, the ball rack down the side, both folded hoops in front on the full-width ramp.</w:t>
       </w:r>
     </w:p>
     <w:p>
@@ -5182,7 +5223,7 @@
           <w:color w:val="334155"/>
           <w:sz w:val="20"/>
         </w:rPr>
-        <w:t>Tile edge: show a slim bevelled edge strip around the tiles unless it looks wrong at this scale.</w:t>
+        <w:t>Floor edge: show a slim bevelled edge strip around the floor unless it looks wrong at this scale.</w:t>
       </w:r>
     </w:p>
     <w:p>
@@ -5208,6 +5249,32 @@
           <w:color w:val="334155"/>
           <w:sz w:val="20"/>
         </w:rPr>
+        <w:t>Floor panels: 1.85 x 2.0 m is a concept size. Hoop Heroes will confirm with the surface supplier what large-format panels or pre-assembled sections are available.</w:t>
+      </w:r>
+    </w:p>
+    <w:p>
+      <w:pPr>
+        <w:spacing w:after="60"/>
+        <w:ind w:left="454" w:hanging="340"/>
+      </w:pPr>
+      <w:r>
+        <w:rPr>
+          <w:rFonts w:ascii="Montserrat" w:hAnsi="Montserrat" w:eastAsia="Montserrat"/>
+          <w:b/>
+          <w:i w:val="0"/>
+          <w:color w:val="14264E"/>
+          <w:sz w:val="20"/>
+        </w:rPr>
+        <w:t xml:space="preserve">5.  </w:t>
+      </w:r>
+      <w:r>
+        <w:rPr>
+          <w:rFonts w:ascii="Montserrat" w:hAnsi="Montserrat" w:eastAsia="Montserrat"/>
+          <w:b w:val="0"/>
+          <w:i w:val="0"/>
+          <w:color w:val="334155"/>
+          <w:sz w:val="20"/>
+        </w:rPr>
         <w:t>Scale figures: empty court preferred. If you think one non-identifiable figure is needed for scale, ask first.</w:t>
       </w:r>
     </w:p>
@@ -5224,7 +5291,7 @@
           <w:color w:val="14264E"/>
           <w:sz w:val="20"/>
         </w:rPr>
-        <w:t xml:space="preserve">5.  </w:t>
+        <w:t xml:space="preserve">6.  </w:t>
       </w:r>
       <w:r>
         <w:rPr>
@@ -5313,7 +5380,7 @@
           <w:color w:val="334155"/>
           <w:sz w:val="20"/>
         </w:rPr>
-        <w:t>UK mini-container supplier specs for 8 ft units</w:t>
+        <w:t>UK container supplier specs for 10 ft units</w:t>
       </w:r>
     </w:p>
     <w:p>

</xml_diff>

<commit_message>
Panels stored flat on a trolley; installation sequence
Floor becomes 60 panels (1.23 x 2.0 m) carried flat on a wheeled trolley
so they cannot bend; it fits behind both folded hoops with the ball rack
between them. The court is now built panel by panel, the portable hoop
mast folds, and a timed installation sequence (hoops out, trolley out,
panels laid, trolley back and stood on end, hoops set up) drives the
viewer's Installation button and a new install video. Adds the As
delivered still; brief, plan and stills updated.

Co-Authored-By: Claude Opus 5.5 <noreply@anthropic.com>
Claude-Session: https://claude.ai/code/session_01UoyugYzmaTfuHsWdpUMhBc
</commit_message>
<xml_diff>
--- a/court-viz/brief/Hoop Hub Phase 1 - Concept Visual Brief v3.docx
+++ b/court-viz/brief/Hoop Hub Phase 1 - Concept Visual Brief v3.docx
@@ -206,7 +206,7 @@
                 <w:color w:val="334155"/>
                 <w:sz w:val="18"/>
               </w:rPr>
-              <w:t>Hub in a box: a 10 ft container carries the whole kit - the floor, both portable hoops and the balls. The floor is now 40 large panels (1.85 x 2.0 m) instead of about 1,650 small tiles, so it goes down and comes up quickly.</w:t>
+              <w:t>Hub in a box: a 10 ft container carries the whole kit - the floor, both portable hoops and the balls. The floor is 60 large panels (1.23 x 2.0 m) instead of about 1,650 small tiles, stored flat on a wheeled trolley so they do not bend. New still (shot 7) shows the container as delivered.</w:t>
             </w:r>
           </w:p>
           <w:p>
@@ -484,7 +484,7 @@
           <w:color w:val="334155"/>
           <w:sz w:val="20"/>
         </w:rPr>
-        <w:t>40 large modular court panels, each 1.85 x 2.0 m, laid 8 across and 5 deep to make 14.8 m wide x 10.0 m deep, directly on the playground tarmac. Show the panel joints faintly.</w:t>
+        <w:t>60 large modular court panels, each 1.23 x 2.0 m, laid 12 across and 5 deep to make 14.8 m wide x 10.0 m deep, directly on the playground tarmac. Show the panel joints faintly.</w:t>
       </w:r>
     </w:p>
     <w:p>
@@ -852,7 +852,7 @@
                 <w:color w:val="334155"/>
                 <w:sz w:val="18"/>
               </w:rPr>
-              <w:t>14.8 m wide x 10.0 m deep (148 m²): 40 panels of 1.85 x 2.0 m (8 across the baseline, 5 deep), about 15 to 20 mm thick, faint joints visible</w:t>
+              <w:t>14.8 m wide x 10.0 m deep (148 m²): 60 panels of 1.233 x 2.0 m (12 across the baseline, 5 deep), about 15 to 20 mm thick, faint joints visible</w:t>
             </w:r>
           </w:p>
         </w:tc>
@@ -2431,7 +2431,7 @@
                 <w:color w:val="334155"/>
                 <w:sz w:val="18"/>
               </w:rPr>
-              <w:t>Large-format modular sports-surface panels, 1.85 x 2.0 m, perforated top, clipped together</w:t>
+              <w:t>Large-format modular sports-surface panels, 1.23 x 2.0 m, perforated top, clipped together</w:t>
             </w:r>
           </w:p>
         </w:tc>
@@ -4330,7 +4330,7 @@
           <w:color w:val="334155"/>
           <w:sz w:val="20"/>
         </w:rPr>
-        <w:t>the Mega Slam is a separate, permanent install done first. The container is then dropped behind it with everything inside: roll the portable hoops out, lay the 40 floor panels, play. Removal is the same in reverse.</w:t>
+        <w:t>the Mega Slam is a separate, permanent install done first. The container is then dropped behind it with everything inside. Roll the hoops out first, then wheel the panel trolley to the court corner and lay the panels off the top, row by row from the Mega Slam end. The empty trolley goes back in and stands on its end against the back wall. Removal is the same in reverse.</w:t>
       </w:r>
     </w:p>
     <w:p>
@@ -4398,7 +4398,7 @@
           <w:color w:val="14264E"/>
           <w:sz w:val="20"/>
         </w:rPr>
-        <w:t xml:space="preserve">Inside (shot 5 only) - </w:t>
+        <w:t xml:space="preserve">Inside - </w:t>
       </w:r>
       <w:r>
         <w:rPr>
@@ -4408,7 +4408,7 @@
           <w:color w:val="334155"/>
           <w:sz w:val="20"/>
         </w:rPr>
-        <w:t>the 40 floor panels stand on edge against the back wall, strapped, with the front panel showing its piece of the painted court; a gold ball rack down the side; both folded portable hoops in front, wheels towards the doors. A ramp the full width of the doorway, so the hoops roll straight in and out.</w:t>
+        <w:t>as delivered (shot 7): the 60 panels lie flat on a low wheeled trolley at the back (stack about 1.4 m high, gold pull handle), both folded hoops in front with the gold ball rack between them. In everyday use (shot 5): the empty trolley stands on its end against the back wall, handle folded, with the hoops and ball rack in front. A ramp the full width of the doorway in both cases.</w:t>
       </w:r>
     </w:p>
     <w:p>
@@ -4804,6 +4804,42 @@
     </w:p>
     <w:p>
       <w:pPr>
+        <w:spacing w:after="60"/>
+        <w:ind w:left="454" w:hanging="340"/>
+      </w:pPr>
+      <w:r>
+        <w:rPr>
+          <w:rFonts w:ascii="Montserrat" w:hAnsi="Montserrat" w:eastAsia="Montserrat"/>
+          <w:b/>
+          <w:i w:val="0"/>
+          <w:color w:val="14264E"/>
+          <w:sz w:val="20"/>
+        </w:rPr>
+        <w:t xml:space="preserve">7.  </w:t>
+      </w:r>
+      <w:r>
+        <w:rPr>
+          <w:rFonts w:ascii="Montserrat" w:hAnsi="Montserrat" w:eastAsia="Montserrat"/>
+          <w:b/>
+          <w:i w:val="0"/>
+          <w:color w:val="14264E"/>
+          <w:sz w:val="20"/>
+        </w:rPr>
+        <w:t xml:space="preserve">As delivered - </w:t>
+      </w:r>
+      <w:r>
+        <w:rPr>
+          <w:rFonts w:ascii="Montserrat" w:hAnsi="Montserrat" w:eastAsia="Montserrat"/>
+          <w:b w:val="0"/>
+          <w:i w:val="0"/>
+          <w:color w:val="334155"/>
+          <w:sz w:val="20"/>
+        </w:rPr>
+        <w:t>elevated (about 3 m), looking square into the open doors, before the floor is laid: the Mega Slam already in on bare tarmac, the panel trolley at the back of the container with the hoops and ball rack in front.</w:t>
+      </w:r>
+    </w:p>
+    <w:p>
+      <w:pPr>
         <w:spacing w:after="80"/>
       </w:pPr>
       <w:r>
@@ -4814,7 +4850,7 @@
           <w:color w:val="14264E"/>
           <w:sz w:val="20"/>
         </w:rPr>
-        <w:t>Total: 8 stills (shot 3 is 3 frames).</w:t>
+        <w:t>Total: 9 stills (shot 3 is 3 frames).</w:t>
       </w:r>
     </w:p>
     <w:p>
@@ -5066,7 +5102,7 @@
           <w:color w:val="334155"/>
           <w:sz w:val="20"/>
         </w:rPr>
-        <w:t>8 x 4K stills (3840 x 2160 px, 16:9) per the shot list, PNG or high-quality JPG, sRGB, each with the "CONCEPT" label.</w:t>
+        <w:t>9 x 4K stills (3840 x 2160 px, 16:9) per the shot list, PNG or high-quality JPG, sRGB, each with the "CONCEPT" label.</w:t>
       </w:r>
     </w:p>
     <w:p>
@@ -5082,7 +5118,23 @@
           <w:color w:val="334155"/>
           <w:sz w:val="20"/>
         </w:rPr>
-        <w:t>The same 8 stills without the label.</w:t>
+        <w:t>The same 9 stills without the label.</w:t>
+      </w:r>
+    </w:p>
+    <w:p>
+      <w:pPr>
+        <w:pStyle w:val="ListBullet"/>
+        <w:spacing w:after="40"/>
+      </w:pPr>
+      <w:r>
+        <w:rPr>
+          <w:rFonts w:ascii="Montserrat" w:hAnsi="Montserrat" w:eastAsia="Montserrat"/>
+          <w:b w:val="0"/>
+          <w:i w:val="0"/>
+          <w:color w:val="334155"/>
+          <w:sz w:val="20"/>
+        </w:rPr>
+        <w:t>Two short videos: a fly-through of the finished hub, and an installation sequence (doors open, hoops out, trolley out, panels laid, trolley back in, hoops set up).</w:t>
       </w:r>
     </w:p>
     <w:p>
@@ -5249,7 +5301,7 @@
           <w:color w:val="334155"/>
           <w:sz w:val="20"/>
         </w:rPr>
-        <w:t>Floor panels: 1.85 x 2.0 m is a concept size. Hoop Heroes will confirm with the surface supplier what large-format panels or pre-assembled sections are available.</w:t>
+        <w:t>Floor panels: 1.23 x 2.0 m is a concept size, chosen so the panel trolley and both hoops fit in a 10 ft container. Hoop Heroes will confirm with the surface supplier what large-format panels or pre-assembled sections are available.</w:t>
       </w:r>
     </w:p>
     <w:p>

</xml_diff>

<commit_message>
Container sides read HOOP HUB under the logo
Replaces the tagline on both long sides with the hub's name in large
gold Lilita One; brief updated to match.

Co-Authored-By: Claude Opus 5.5 <noreply@anthropic.com>
Claude-Session: https://claude.ai/code/session_01UoyugYzmaTfuHsWdpUMhBc
</commit_message>
<xml_diff>
--- a/court-viz/brief/Hoop Hub Phase 1 - Concept Visual Brief v3.docx
+++ b/court-viz/brief/Hoop Hub Phase 1 - Concept Visual Brief v3.docx
@@ -191,7 +191,7 @@
                 <w:color w:val="334155"/>
                 <w:sz w:val="18"/>
               </w:rPr>
-              <w:t>Container is now a billboard in a navy wrap with a gold stripe: huge logo and tagline on both long sides, a QR code (Book a FREE Trial) and round logo on the doors. Full-width ramp; two ball racks inside, no hanging bags.</w:t>
+              <w:t>Container is now a billboard in a navy wrap with a gold stripe: huge logo with HOOP HUB in large gold letters beneath on both long sides, a QR code (Book a FREE Trial) and round logo on the doors. Full-width ramp; two ball racks inside, no hanging bags.</w:t>
             </w:r>
           </w:p>
           <w:p>
@@ -4382,7 +4382,7 @@
           <w:color w:val="334155"/>
           <w:sz w:val="20"/>
         </w:rPr>
-        <w:t>full vinyl wrap: navy #14264e base with a gold #fba91a stripe low down. Both long sides: the landscape logo (gold icon, white wordmark) as large as fits, with 'SWAP SCREENTIME FOR GAMETIME' beneath in gold Lilita One. Doors: one leaf carries a white panel with 'SCAN TO BOOK A FREE TRIAL' and a navy QR code; the other carries the round white logo and 'HOOP HEROES' in gold. Keep both clear of the vertical locking bars. Far end: the round white logo, large. No contact details or school name.</w:t>
+        <w:t>full vinyl wrap: navy #14264e base with a gold #fba91a stripe low down. Both long sides: the landscape logo (gold icon, white wordmark) as large as fits, with 'HOOP HUB' beneath in large gold Lilita One. Doors: one leaf carries a white panel with 'SCAN TO BOOK A FREE TRIAL' and a navy QR code; the other carries the round white logo and 'HOOP HEROES' in gold. Keep both clear of the vertical locking bars. Far end: the round white logo, large. No contact details or school name.</w:t>
       </w:r>
     </w:p>
     <w:p>

</xml_diff>

<commit_message>
Share pack for the Hoop Hub concept
Adds a pack for passing the concept to another agent: the v3 brief, the
to-scale markings plan, four current 3D views (top-down, overview,
container in use, container as delivered) and a one-page summary. Brief
updated for the new packing order (trolley by the doors, hoops behind).

Co-Authored-By: Claude Opus 5.5 <noreply@anthropic.com>
Claude-Session: https://claude.ai/code/session_01UoyugYzmaTfuHsWdpUMhBc
</commit_message>
<xml_diff>
--- a/court-viz/brief/Hoop Hub Phase 1 - Concept Visual Brief v3.docx
+++ b/court-viz/brief/Hoop Hub Phase 1 - Concept Visual Brief v3.docx
@@ -4330,7 +4330,7 @@
           <w:color w:val="334155"/>
           <w:sz w:val="20"/>
         </w:rPr>
-        <w:t>the Mega Slam is a separate, permanent install done first. The container is then dropped behind it with everything inside. Roll the hoops out first, then wheel the panel trolley to the court corner and lay the panels off the top, row by row from the Mega Slam end. The empty trolley goes back in and stands on its end against the back wall. Removal is the same in reverse.</w:t>
+        <w:t>three steps. 1: the Mega Slam goes in (a separate, permanent install). 2: the container is dropped behind it; the loaded panel trolley rolls out to the court corner and the panels are laid off the top, row by row from the Mega Slam end. 3: the trolley moves aside, both portable hoops roll out into position and go up, then the empty trolley goes back in and stands on its end against the back wall. Removal is the same in reverse.</w:t>
       </w:r>
     </w:p>
     <w:p>
@@ -4408,7 +4408,7 @@
           <w:color w:val="334155"/>
           <w:sz w:val="20"/>
         </w:rPr>
-        <w:t>as delivered (shot 7): the 60 panels lie flat on a low wheeled trolley at the back (stack about 1.4 m high, gold pull handle), both folded hoops in front with the gold ball rack between them. In everyday use (shot 5): the empty trolley stands on its end against the back wall, handle folded, with the hoops and ball rack in front. A ramp the full width of the doorway in both cases.</w:t>
+        <w:t>as delivered (shot 7): the loaded panel trolley (60 panels flat, stack about 1.4 m high, gold pull handle) sits by the doors, with both folded hoops and the gold ball rack between them behind it, so the floor comes out first. In everyday use (shot 5): the empty trolley stands on its end against the back wall, handle folded, with the ball rack in front of it and the folded hoops by the doors when they are not out. A ramp the full width of the doorway in both cases.</w:t>
       </w:r>
     </w:p>
     <w:p>

</xml_diff>